<commit_message>
Remove emoji icons from the website and refresh the Task 2 evidence
Co-Authored-By: Claude Opus 5.5 <noreply@anthropic.com>
Claude-Session: https://claude.ai/code/session_0169c4H9gfG1hJ5VJ2T1GCFJ
</commit_message>
<xml_diff>
--- a/docs/task2/xisd6329-task2-group11-mobile-app.docx
+++ b/docs/task2/xisd6329-task2-group11-mobile-app.docx
@@ -6130,7 +6130,7 @@
                 <w:sz w:val="19"/>
                 <w:szCs w:val="19"/>
               </w:rPr>
-              <w:t>Edited the storefront copy so that sentences are no longer joined with dashes, which read as unfinished on a small screen. Eight phrases were rewritten, including the catalogue heading, the product button and the checkout note.</w:t>
+              <w:t>Edited the storefront copy so that sentences are no longer joined with dashes, which read as unfinished on a small screen. Eight phrases were rewritten, including the catalogue heading, the product button and the checkout note. Emoji icons were also removed from the navigation, buttons and form labels on both the website and the mobile web app, so every label is plain text.</w:t>
             </w:r>
           </w:p>
         </w:tc>
@@ -27077,7 +27077,7 @@
                 <w:sz w:val="19"/>
                 <w:szCs w:val="19"/>
               </w:rPr>
-              <w:t>☑</w:t>
+              <w:t>Yes</w:t>
             </w:r>
           </w:p>
         </w:tc>
@@ -27150,7 +27150,7 @@
                 <w:sz w:val="19"/>
                 <w:szCs w:val="19"/>
               </w:rPr>
-              <w:t>☑</w:t>
+              <w:t>Yes</w:t>
             </w:r>
           </w:p>
         </w:tc>
@@ -27220,7 +27220,7 @@
                 <w:sz w:val="19"/>
                 <w:szCs w:val="19"/>
               </w:rPr>
-              <w:t>☑</w:t>
+              <w:t>Yes</w:t>
             </w:r>
           </w:p>
         </w:tc>
@@ -27436,7 +27436,7 @@
                 <w:sz w:val="19"/>
                 <w:szCs w:val="19"/>
               </w:rPr>
-              <w:t>☑</w:t>
+              <w:t>Yes</w:t>
             </w:r>
           </w:p>
         </w:tc>
@@ -27506,7 +27506,7 @@
                 <w:sz w:val="19"/>
                 <w:szCs w:val="19"/>
               </w:rPr>
-              <w:t>☑</w:t>
+              <w:t>Yes</w:t>
             </w:r>
           </w:p>
         </w:tc>
@@ -27579,7 +27579,7 @@
                 <w:sz w:val="19"/>
                 <w:szCs w:val="19"/>
               </w:rPr>
-              <w:t>☑</w:t>
+              <w:t>Yes</w:t>
             </w:r>
           </w:p>
         </w:tc>
@@ -27649,7 +27649,7 @@
                 <w:sz w:val="19"/>
                 <w:szCs w:val="19"/>
               </w:rPr>
-              <w:t>☑</w:t>
+              <w:t>Yes</w:t>
             </w:r>
           </w:p>
         </w:tc>
@@ -27722,7 +27722,7 @@
                 <w:sz w:val="19"/>
                 <w:szCs w:val="19"/>
               </w:rPr>
-              <w:t>☑</w:t>
+              <w:t>Yes</w:t>
             </w:r>
           </w:p>
         </w:tc>
@@ -27792,7 +27792,7 @@
                 <w:sz w:val="19"/>
                 <w:szCs w:val="19"/>
               </w:rPr>
-              <w:t>☑</w:t>
+              <w:t>Yes</w:t>
             </w:r>
           </w:p>
         </w:tc>
@@ -27865,7 +27865,7 @@
                 <w:sz w:val="19"/>
                 <w:szCs w:val="19"/>
               </w:rPr>
-              <w:t>☑</w:t>
+              <w:t>Yes</w:t>
             </w:r>
           </w:p>
         </w:tc>
@@ -27935,7 +27935,7 @@
                 <w:sz w:val="19"/>
                 <w:szCs w:val="19"/>
               </w:rPr>
-              <w:t>☑</w:t>
+              <w:t>Yes</w:t>
             </w:r>
             <w:r>
               <w:rPr>
@@ -28015,7 +28015,7 @@
                 <w:sz w:val="19"/>
                 <w:szCs w:val="19"/>
               </w:rPr>
-              <w:t>☑</w:t>
+              <w:t>Yes</w:t>
             </w:r>
           </w:p>
         </w:tc>
@@ -28085,7 +28085,7 @@
                 <w:sz w:val="19"/>
                 <w:szCs w:val="19"/>
               </w:rPr>
-              <w:t>☑</w:t>
+              <w:t>Yes</w:t>
             </w:r>
           </w:p>
         </w:tc>
@@ -28158,7 +28158,7 @@
                 <w:sz w:val="19"/>
                 <w:szCs w:val="19"/>
               </w:rPr>
-              <w:t>☑</w:t>
+              <w:t>Yes</w:t>
             </w:r>
           </w:p>
         </w:tc>
@@ -28302,7 +28302,7 @@
                 <w:sz w:val="19"/>
                 <w:szCs w:val="19"/>
               </w:rPr>
-              <w:t>☑</w:t>
+              <w:t>Yes</w:t>
             </w:r>
           </w:p>
         </w:tc>
@@ -28372,7 +28372,7 @@
                 <w:sz w:val="19"/>
                 <w:szCs w:val="19"/>
               </w:rPr>
-              <w:t>☑</w:t>
+              <w:t>Yes</w:t>
             </w:r>
           </w:p>
         </w:tc>
@@ -28445,7 +28445,7 @@
                 <w:sz w:val="19"/>
                 <w:szCs w:val="19"/>
               </w:rPr>
-              <w:t>☑</w:t>
+              <w:t>Yes</w:t>
             </w:r>
           </w:p>
         </w:tc>

</xml_diff>